<commit_message>
Corrige acentuacao no Word processo_abertura_chamados_ativos_glpi
</commit_message>
<xml_diff>
--- a/documentações/Processos/docx/processo_abertura_chamados_ativos_glpi.docx
+++ b/documentações/Processos/docx/processo_abertura_chamados_ativos_glpi.docx
@@ -41,7 +41,7 @@
           <w:color w:val="5E6B78"/>
           <w:sz w:val="19"/>
         </w:rPr>
-        <w:t>Ãrea responsÃ¡vel e versÃ£o conforme documentaÃ§Ã£o institucional</w:t>
+        <w:t>Área responsável e versão conforme documentação institucional</w:t>
       </w:r>
     </w:p>
     <w:p>
@@ -1756,40 +1756,7 @@
         <w:keepNext/>
         <w:jc w:val="center"/>
       </w:pPr>
-      <w:r>
-        <w:drawing>
-          <wp:inline xmlns:a="http://schemas.openxmlformats.org/drawingml/2006/main" xmlns:pic="http://schemas.openxmlformats.org/drawingml/2006/picture">
-            <wp:extent cx="2712720" cy="1146048"/>
-            <wp:docPr id="1" name="Picture 1"/>
-            <wp:cNvGraphicFramePr>
-              <a:graphicFrameLocks noChangeAspect="1"/>
-            </wp:cNvGraphicFramePr>
-            <a:graphic>
-              <a:graphicData uri="http://schemas.openxmlformats.org/drawingml/2006/picture">
-                <pic:pic>
-                  <pic:nvPicPr>
-                    <pic:cNvPr id="0" name="processo_abertura_chamados_ativos_glpi_1.png"/>
-                    <pic:cNvPicPr/>
-                  </pic:nvPicPr>
-                  <pic:blipFill>
-                    <a:blip r:embed="rId11"/>
-                    <a:stretch>
-                      <a:fillRect/>
-                    </a:stretch>
-                  </pic:blipFill>
-                  <pic:spPr>
-                    <a:xfrm>
-                      <a:off x="0" y="0"/>
-                      <a:ext cx="2712720" cy="1146048"/>
-                    </a:xfrm>
-                    <a:prstGeom prst="rect"/>
-                  </pic:spPr>
-                </pic:pic>
-              </a:graphicData>
-            </a:graphic>
-          </wp:inline>
-        </w:drawing>
-      </w:r>
+      <w:r/>
     </w:p>
     <w:p>
       <w:pPr>
@@ -3710,6 +3677,8 @@
     <w:sectPr>
       <w:headerReference w:type="default" r:id="rId9"/>
       <w:footerReference w:type="default" r:id="rId10"/>
+      <w:headerReference w:type="first" r:id="rId12"/>
+      <w:footerReference w:type="first" r:id="rId13"/>
       <w:pgSz w:w="12240" w:h="15840"/>
       <w:pgMar w:top="1080" w:right="1123" w:bottom="1080" w:left="1123" w:header="504" w:footer="504" w:gutter="0"/>
       <w:cols w:space="720"/>
@@ -3732,7 +3701,7 @@
         <w:color w:val="5E6B78"/>
         <w:sz w:val="17"/>
       </w:rPr>
-      <w:t xml:space="preserve">Secretaria de SaÃºde do Recife  |  </w:t>
+      <w:t xml:space="preserve">Secretaria de Saúde do Recife  |  </w:t>
     </w:r>
     <w:r>
       <w:rPr>
@@ -3740,9 +3709,19 @@
         <w:color w:val="5E6B78"/>
         <w:sz w:val="18"/>
       </w:rPr>
-      <w:t xml:space="preserve">PÃ¡gina </w:t>
+      <w:t xml:space="preserve">Página </w:t>
     </w:r>
     <w:fldSimple w:instr="PAGE"/>
+  </w:p>
+</w:ftr>
+</file>
+
+<file path=word/footer2.xml><?xml version="1.0" encoding="utf-8"?>
+<w:ftr xmlns:m="http://schemas.openxmlformats.org/officeDocument/2006/math" xmlns:mc="http://schemas.openxmlformats.org/markup-compatibility/2006" xmlns:mo="http://schemas.microsoft.com/office/mac/office/2008/main" xmlns:mv="urn:schemas-microsoft-com:mac:vml" xmlns:o="urn:schemas-microsoft-com:office:office" xmlns:r="http://schemas.openxmlformats.org/officeDocument/2006/relationships" xmlns:v="urn:schemas-microsoft-com:vml" xmlns:w10="urn:schemas-microsoft-com:office:word" xmlns:w14="http://schemas.microsoft.com/office/word/2010/wordml" xmlns:w="http://schemas.openxmlformats.org/wordprocessingml/2006/main" xmlns:wne="http://schemas.microsoft.com/office/word/2006/wordml" xmlns:wp14="http://schemas.microsoft.com/office/word/2010/wordprocessingDrawing" xmlns:wp="http://schemas.openxmlformats.org/drawingml/2006/wordprocessingDrawing" xmlns:wpc="http://schemas.microsoft.com/office/word/2010/wordprocessingCanvas" xmlns:wpg="http://schemas.microsoft.com/office/word/2010/wordprocessingGroup" xmlns:wpi="http://schemas.microsoft.com/office/word/2010/wordprocessingInk" xmlns:wps="http://schemas.microsoft.com/office/word/2010/wordprocessingShape" mc:Ignorable="w14 wp14">
+  <w:p>
+    <w:pPr>
+      <w:pStyle w:val="Footer"/>
+    </w:pPr>
   </w:p>
 </w:ftr>
 </file>
@@ -3761,8 +3740,18 @@
         <w:color w:val="5E6B78"/>
         <w:sz w:val="17"/>
       </w:rPr>
-      <w:t>SAÃšDE DIGITAL ATENDE  |  PROCESSO OPERACIONAL</w:t>
+      <w:t>SAÚDE DIGITAL ATENDE  |  PROCESSO OPERACIONAL</w:t>
     </w:r>
+  </w:p>
+</w:hdr>
+</file>
+
+<file path=word/header2.xml><?xml version="1.0" encoding="utf-8"?>
+<w:hdr xmlns:m="http://schemas.openxmlformats.org/officeDocument/2006/math" xmlns:mc="http://schemas.openxmlformats.org/markup-compatibility/2006" xmlns:mo="http://schemas.microsoft.com/office/mac/office/2008/main" xmlns:mv="urn:schemas-microsoft-com:mac:vml" xmlns:o="urn:schemas-microsoft-com:office:office" xmlns:r="http://schemas.openxmlformats.org/officeDocument/2006/relationships" xmlns:v="urn:schemas-microsoft-com:vml" xmlns:w10="urn:schemas-microsoft-com:office:word" xmlns:w14="http://schemas.microsoft.com/office/word/2010/wordml" xmlns:w="http://schemas.openxmlformats.org/wordprocessingml/2006/main" xmlns:wne="http://schemas.microsoft.com/office/word/2006/wordml" xmlns:wp14="http://schemas.microsoft.com/office/word/2010/wordprocessingDrawing" xmlns:wp="http://schemas.openxmlformats.org/drawingml/2006/wordprocessingDrawing" xmlns:wpc="http://schemas.microsoft.com/office/word/2010/wordprocessingCanvas" xmlns:wpg="http://schemas.microsoft.com/office/word/2010/wordprocessingGroup" xmlns:wpi="http://schemas.microsoft.com/office/word/2010/wordprocessingInk" xmlns:wps="http://schemas.microsoft.com/office/word/2010/wordprocessingShape" mc:Ignorable="w14 wp14">
+  <w:p>
+    <w:pPr>
+      <w:pStyle w:val="Header"/>
+    </w:pPr>
   </w:p>
 </w:hdr>
 </file>

</xml_diff>

<commit_message>
Atualiza Word padronizado processo_abertura_chamados_ativos_glpi
</commit_message>
<xml_diff>
--- a/documentações/Processos/docx/processo_abertura_chamados_ativos_glpi.docx
+++ b/documentações/Processos/docx/processo_abertura_chamados_ativos_glpi.docx
@@ -404,492 +404,7 @@
         <w:pStyle w:val="Heading1"/>
       </w:pPr>
       <w:r>
-        <w:t>Definições</w:t>
-      </w:r>
-    </w:p>
-    <w:tbl>
-      <w:tblPr>
-        <w:tblStyle w:val="TableGrid"/>
-        <w:tblW w:type="auto" w:w="0"/>
-        <w:jc w:val="center"/>
-        <w:tblLayout w:type="fixed"/>
-        <w:tblLook w:firstColumn="1" w:firstRow="1" w:lastColumn="0" w:lastRow="0" w:noHBand="0" w:noVBand="1" w:val="04A0"/>
-      </w:tblPr>
-      <w:tblGrid>
-        <w:gridCol w:w="2600"/>
-        <w:gridCol w:w="6760"/>
-      </w:tblGrid>
-      <w:tr>
-        <w:trPr>
-          <w:tblHeader w:val="true"/>
-        </w:trPr>
-        <w:tc>
-          <w:tcPr>
-            <w:tcW w:type="dxa" w:w="2600"/>
-            <w:tcMar>
-              <w:top w:w="90" w:type="dxa"/>
-              <w:start w:w="120" w:type="dxa"/>
-              <w:bottom w:w="90" w:type="dxa"/>
-              <w:end w:w="120" w:type="dxa"/>
-            </w:tcMar>
-            <w:vAlign w:val="center"/>
-            <w:shd w:fill="EAF2F8"/>
-          </w:tcPr>
-          <w:p>
-            <w:pPr>
-              <w:spacing w:after="0"/>
-            </w:pPr>
-            <w:r>
-              <w:rPr>
-                <w:rFonts w:ascii="Arial" w:hAnsi="Arial"/>
-                <w:b/>
-                <w:color w:val="163A63"/>
-                <w:sz w:val="18"/>
-              </w:rPr>
-              <w:t>Termo</w:t>
-            </w:r>
-          </w:p>
-        </w:tc>
-        <w:tc>
-          <w:tcPr>
-            <w:tcW w:type="dxa" w:w="6760"/>
-            <w:tcMar>
-              <w:top w:w="90" w:type="dxa"/>
-              <w:start w:w="120" w:type="dxa"/>
-              <w:bottom w:w="90" w:type="dxa"/>
-              <w:end w:w="120" w:type="dxa"/>
-            </w:tcMar>
-            <w:vAlign w:val="center"/>
-            <w:shd w:fill="EAF2F8"/>
-          </w:tcPr>
-          <w:p>
-            <w:pPr>
-              <w:spacing w:after="0"/>
-            </w:pPr>
-            <w:r>
-              <w:rPr>
-                <w:rFonts w:ascii="Arial" w:hAnsi="Arial"/>
-                <w:b/>
-                <w:color w:val="163A63"/>
-                <w:sz w:val="18"/>
-              </w:rPr>
-              <w:t>Definição</w:t>
-            </w:r>
-          </w:p>
-        </w:tc>
-      </w:tr>
-      <w:tr>
-        <w:tc>
-          <w:tcPr>
-            <w:tcW w:type="dxa" w:w="2600"/>
-            <w:tcMar>
-              <w:top w:w="90" w:type="dxa"/>
-              <w:start w:w="120" w:type="dxa"/>
-              <w:bottom w:w="90" w:type="dxa"/>
-              <w:end w:w="120" w:type="dxa"/>
-            </w:tcMar>
-            <w:vAlign w:val="center"/>
-          </w:tcPr>
-          <w:p>
-            <w:pPr>
-              <w:spacing w:after="0"/>
-            </w:pPr>
-            <w:r>
-              <w:rPr>
-                <w:rFonts w:ascii="Arial" w:hAnsi="Arial"/>
-                <w:sz w:val="18"/>
-              </w:rPr>
-              <w:t>GLPI</w:t>
-            </w:r>
-          </w:p>
-        </w:tc>
-        <w:tc>
-          <w:tcPr>
-            <w:tcW w:type="dxa" w:w="6760"/>
-            <w:tcMar>
-              <w:top w:w="90" w:type="dxa"/>
-              <w:start w:w="120" w:type="dxa"/>
-              <w:bottom w:w="90" w:type="dxa"/>
-              <w:end w:w="120" w:type="dxa"/>
-            </w:tcMar>
-            <w:vAlign w:val="center"/>
-          </w:tcPr>
-          <w:p>
-            <w:pPr>
-              <w:spacing w:after="0"/>
-            </w:pPr>
-            <w:r>
-              <w:rPr>
-                <w:rFonts w:ascii="Arial" w:hAnsi="Arial"/>
-                <w:sz w:val="18"/>
-              </w:rPr>
-              <w:t>Sistema de gestão de chamados e inventário de TI utilizado pela GTIC.</w:t>
-            </w:r>
-          </w:p>
-        </w:tc>
-      </w:tr>
-      <w:tr>
-        <w:tc>
-          <w:tcPr>
-            <w:tcW w:type="dxa" w:w="2600"/>
-            <w:tcMar>
-              <w:top w:w="90" w:type="dxa"/>
-              <w:start w:w="120" w:type="dxa"/>
-              <w:bottom w:w="90" w:type="dxa"/>
-              <w:end w:w="120" w:type="dxa"/>
-            </w:tcMar>
-            <w:vAlign w:val="center"/>
-          </w:tcPr>
-          <w:p>
-            <w:pPr>
-              <w:spacing w:after="0"/>
-            </w:pPr>
-            <w:r>
-              <w:rPr>
-                <w:rFonts w:ascii="Arial" w:hAnsi="Arial"/>
-                <w:sz w:val="18"/>
-              </w:rPr>
-              <w:t>Ativo</w:t>
-            </w:r>
-          </w:p>
-        </w:tc>
-        <w:tc>
-          <w:tcPr>
-            <w:tcW w:type="dxa" w:w="6760"/>
-            <w:tcMar>
-              <w:top w:w="90" w:type="dxa"/>
-              <w:start w:w="120" w:type="dxa"/>
-              <w:bottom w:w="90" w:type="dxa"/>
-              <w:end w:w="120" w:type="dxa"/>
-            </w:tcMar>
-            <w:vAlign w:val="center"/>
-          </w:tcPr>
-          <w:p>
-            <w:pPr>
-              <w:spacing w:after="0"/>
-            </w:pPr>
-            <w:r>
-              <w:rPr>
-                <w:rFonts w:ascii="Arial" w:hAnsi="Arial"/>
-                <w:sz w:val="18"/>
-              </w:rPr>
-              <w:t>Equipamento ou item de TI cadastrado no inventário do GLPI, como computador, monitor, impressora, roteador ou item equivalente.</w:t>
-            </w:r>
-          </w:p>
-        </w:tc>
-      </w:tr>
-      <w:tr>
-        <w:tc>
-          <w:tcPr>
-            <w:tcW w:type="dxa" w:w="2600"/>
-            <w:tcMar>
-              <w:top w:w="90" w:type="dxa"/>
-              <w:start w:w="120" w:type="dxa"/>
-              <w:bottom w:w="90" w:type="dxa"/>
-              <w:end w:w="120" w:type="dxa"/>
-            </w:tcMar>
-            <w:vAlign w:val="center"/>
-          </w:tcPr>
-          <w:p>
-            <w:pPr>
-              <w:spacing w:after="0"/>
-            </w:pPr>
-            <w:r>
-              <w:rPr>
-                <w:rFonts w:ascii="Arial" w:hAnsi="Arial"/>
-                <w:sz w:val="18"/>
-              </w:rPr>
-              <w:t>Chamado principal</w:t>
-            </w:r>
-          </w:p>
-        </w:tc>
-        <w:tc>
-          <w:tcPr>
-            <w:tcW w:type="dxa" w:w="6760"/>
-            <w:tcMar>
-              <w:top w:w="90" w:type="dxa"/>
-              <w:start w:w="120" w:type="dxa"/>
-              <w:bottom w:w="90" w:type="dxa"/>
-              <w:end w:w="120" w:type="dxa"/>
-            </w:tcMar>
-            <w:vAlign w:val="center"/>
-          </w:tcPr>
-          <w:p>
-            <w:pPr>
-              <w:spacing w:after="0"/>
-            </w:pPr>
-            <w:r>
-              <w:rPr>
-                <w:rFonts w:ascii="Arial" w:hAnsi="Arial"/>
-                <w:sz w:val="18"/>
-              </w:rPr>
-              <w:t>Chamado aberto pela Central de Serviços para registrar a solicitação do usuário.</w:t>
-            </w:r>
-          </w:p>
-        </w:tc>
-      </w:tr>
-      <w:tr>
-        <w:tc>
-          <w:tcPr>
-            <w:tcW w:type="dxa" w:w="2600"/>
-            <w:tcMar>
-              <w:top w:w="90" w:type="dxa"/>
-              <w:start w:w="120" w:type="dxa"/>
-              <w:bottom w:w="90" w:type="dxa"/>
-              <w:end w:w="120" w:type="dxa"/>
-            </w:tcMar>
-            <w:vAlign w:val="center"/>
-          </w:tcPr>
-          <w:p>
-            <w:pPr>
-              <w:spacing w:after="0"/>
-            </w:pPr>
-            <w:r>
-              <w:rPr>
-                <w:rFonts w:ascii="Arial" w:hAnsi="Arial"/>
-                <w:sz w:val="18"/>
-              </w:rPr>
-              <w:t>Item associado</w:t>
-            </w:r>
-          </w:p>
-        </w:tc>
-        <w:tc>
-          <w:tcPr>
-            <w:tcW w:type="dxa" w:w="6760"/>
-            <w:tcMar>
-              <w:top w:w="90" w:type="dxa"/>
-              <w:start w:w="120" w:type="dxa"/>
-              <w:bottom w:w="90" w:type="dxa"/>
-              <w:end w:w="120" w:type="dxa"/>
-            </w:tcMar>
-            <w:vAlign w:val="center"/>
-          </w:tcPr>
-          <w:p>
-            <w:pPr>
-              <w:spacing w:after="0"/>
-            </w:pPr>
-            <w:r>
-              <w:rPr>
-                <w:rFonts w:ascii="Arial" w:hAnsi="Arial"/>
-                <w:sz w:val="18"/>
-              </w:rPr>
-              <w:t>Vínculo do ativo ao chamado na aba Itens do GLPI.</w:t>
-            </w:r>
-          </w:p>
-        </w:tc>
-      </w:tr>
-      <w:tr>
-        <w:tc>
-          <w:tcPr>
-            <w:tcW w:type="dxa" w:w="2600"/>
-            <w:tcMar>
-              <w:top w:w="90" w:type="dxa"/>
-              <w:start w:w="120" w:type="dxa"/>
-              <w:bottom w:w="90" w:type="dxa"/>
-              <w:end w:w="120" w:type="dxa"/>
-            </w:tcMar>
-            <w:vAlign w:val="center"/>
-          </w:tcPr>
-          <w:p>
-            <w:pPr>
-              <w:spacing w:after="0"/>
-            </w:pPr>
-            <w:r>
-              <w:rPr>
-                <w:rFonts w:ascii="Arial" w:hAnsi="Arial"/>
-                <w:sz w:val="18"/>
-              </w:rPr>
-              <w:t>Chamado vinculado/associado</w:t>
-            </w:r>
-          </w:p>
-        </w:tc>
-        <w:tc>
-          <w:tcPr>
-            <w:tcW w:type="dxa" w:w="6760"/>
-            <w:tcMar>
-              <w:top w:w="90" w:type="dxa"/>
-              <w:start w:w="120" w:type="dxa"/>
-              <w:bottom w:w="90" w:type="dxa"/>
-              <w:end w:w="120" w:type="dxa"/>
-            </w:tcMar>
-            <w:vAlign w:val="center"/>
-          </w:tcPr>
-          <w:p>
-            <w:pPr>
-              <w:spacing w:after="0"/>
-            </w:pPr>
-            <w:r>
-              <w:rPr>
-                <w:rFonts w:ascii="Arial" w:hAnsi="Arial"/>
-                <w:sz w:val="18"/>
-              </w:rPr>
-              <w:t>Chamado vinculado/associado aberto para regularizar o ativo não localizado e manter relação com o chamado principal.</w:t>
-            </w:r>
-          </w:p>
-        </w:tc>
-      </w:tr>
-      <w:tr>
-        <w:tc>
-          <w:tcPr>
-            <w:tcW w:type="dxa" w:w="2600"/>
-            <w:tcMar>
-              <w:top w:w="90" w:type="dxa"/>
-              <w:start w:w="120" w:type="dxa"/>
-              <w:bottom w:w="90" w:type="dxa"/>
-              <w:end w:w="120" w:type="dxa"/>
-            </w:tcMar>
-            <w:vAlign w:val="center"/>
-          </w:tcPr>
-          <w:p>
-            <w:pPr>
-              <w:spacing w:after="0"/>
-            </w:pPr>
-            <w:r>
-              <w:rPr>
-                <w:rFonts w:ascii="Arial" w:hAnsi="Arial"/>
-                <w:sz w:val="18"/>
-              </w:rPr>
-              <w:t>Central de Serviços</w:t>
-            </w:r>
-          </w:p>
-        </w:tc>
-        <w:tc>
-          <w:tcPr>
-            <w:tcW w:type="dxa" w:w="6760"/>
-            <w:tcMar>
-              <w:top w:w="90" w:type="dxa"/>
-              <w:start w:w="120" w:type="dxa"/>
-              <w:bottom w:w="90" w:type="dxa"/>
-              <w:end w:w="120" w:type="dxa"/>
-            </w:tcMar>
-            <w:vAlign w:val="center"/>
-          </w:tcPr>
-          <w:p>
-            <w:pPr>
-              <w:spacing w:after="0"/>
-            </w:pPr>
-            <w:r>
-              <w:rPr>
-                <w:rFonts w:ascii="Arial" w:hAnsi="Arial"/>
-                <w:sz w:val="18"/>
-              </w:rPr>
-              <w:t>Equipe responsável pela abertura dos chamados no GLPI.</w:t>
-            </w:r>
-          </w:p>
-        </w:tc>
-      </w:tr>
-      <w:tr>
-        <w:tc>
-          <w:tcPr>
-            <w:tcW w:type="dxa" w:w="2600"/>
-            <w:tcMar>
-              <w:top w:w="90" w:type="dxa"/>
-              <w:start w:w="120" w:type="dxa"/>
-              <w:bottom w:w="90" w:type="dxa"/>
-              <w:end w:w="120" w:type="dxa"/>
-            </w:tcMar>
-            <w:vAlign w:val="center"/>
-          </w:tcPr>
-          <w:p>
-            <w:pPr>
-              <w:spacing w:after="0"/>
-            </w:pPr>
-            <w:r>
-              <w:rPr>
-                <w:rFonts w:ascii="Arial" w:hAnsi="Arial"/>
-                <w:sz w:val="18"/>
-              </w:rPr>
-              <w:t>Técnico N2 Suporte</w:t>
-            </w:r>
-          </w:p>
-        </w:tc>
-        <w:tc>
-          <w:tcPr>
-            <w:tcW w:type="dxa" w:w="6760"/>
-            <w:tcMar>
-              <w:top w:w="90" w:type="dxa"/>
-              <w:start w:w="120" w:type="dxa"/>
-              <w:bottom w:w="90" w:type="dxa"/>
-              <w:end w:w="120" w:type="dxa"/>
-            </w:tcMar>
-            <w:vAlign w:val="center"/>
-          </w:tcPr>
-          <w:p>
-            <w:pPr>
-              <w:spacing w:after="0"/>
-            </w:pPr>
-            <w:r>
-              <w:rPr>
-                <w:rFonts w:ascii="Arial" w:hAnsi="Arial"/>
-                <w:sz w:val="18"/>
-              </w:rPr>
-              <w:t>Técnico N2 Suporte responsável por localizar, cadastrar, corrigir ou inventariar ativos físicos no GLPI e associá-los ao chamado principal.</w:t>
-            </w:r>
-          </w:p>
-        </w:tc>
-      </w:tr>
-      <w:tr>
-        <w:tc>
-          <w:tcPr>
-            <w:tcW w:type="dxa" w:w="2600"/>
-            <w:tcMar>
-              <w:top w:w="90" w:type="dxa"/>
-              <w:start w:w="120" w:type="dxa"/>
-              <w:bottom w:w="90" w:type="dxa"/>
-              <w:end w:w="120" w:type="dxa"/>
-            </w:tcMar>
-            <w:vAlign w:val="center"/>
-          </w:tcPr>
-          <w:p>
-            <w:pPr>
-              <w:spacing w:after="0"/>
-            </w:pPr>
-            <w:r>
-              <w:rPr>
-                <w:rFonts w:ascii="Arial" w:hAnsi="Arial"/>
-                <w:sz w:val="18"/>
-              </w:rPr>
-              <w:t>Setor de Sistemas</w:t>
-            </w:r>
-          </w:p>
-        </w:tc>
-        <w:tc>
-          <w:tcPr>
-            <w:tcW w:type="dxa" w:w="6760"/>
-            <w:tcMar>
-              <w:top w:w="90" w:type="dxa"/>
-              <w:start w:w="120" w:type="dxa"/>
-              <w:bottom w:w="90" w:type="dxa"/>
-              <w:end w:w="120" w:type="dxa"/>
-            </w:tcMar>
-            <w:vAlign w:val="center"/>
-          </w:tcPr>
-          <w:p>
-            <w:pPr>
-              <w:spacing w:after="0"/>
-            </w:pPr>
-            <w:r>
-              <w:rPr>
-                <w:rFonts w:ascii="Arial" w:hAnsi="Arial"/>
-                <w:sz w:val="18"/>
-              </w:rPr>
-              <w:t>Equipe responsável por demandas de sistemas. Não realiza inventário e não é responsável por qualquer tipo de ativo físico.</w:t>
-            </w:r>
-          </w:p>
-        </w:tc>
-      </w:tr>
-    </w:tbl>
-    <w:p>
-      <w:pPr>
-        <w:spacing w:after="40"/>
-      </w:pPr>
-    </w:p>
-    <w:p>
-      <w:pPr>
-        <w:pStyle w:val="Heading1"/>
-      </w:pPr>
-      <w:r>
-        <w:t>Fluxo resumido Visão rápida</w:t>
+        <w:t>Fluxo resumido</w:t>
       </w:r>
     </w:p>
     <w:p>
@@ -929,7 +444,7 @@
         <w:pStyle w:val="Heading1"/>
       </w:pPr>
       <w:r>
-        <w:t>Processo 1 Abertura com ativo localizado</w:t>
+        <w:t>Processo 1 - Abertura com ativo localizado</w:t>
       </w:r>
     </w:p>
     <w:tbl>
@@ -1778,7 +1293,7 @@
         <w:pStyle w:val="Heading1"/>
       </w:pPr>
       <w:r>
-        <w:t>Processo 2 Abertura com ativo não localizado</w:t>
+        <w:t>Processo 2 - Abertura com ativo não localizado</w:t>
       </w:r>
     </w:p>
     <w:p>
@@ -2418,7 +1933,7 @@
         <w:pStyle w:val="Heading1"/>
       </w:pPr>
       <w:r>
-        <w:t>Processo 3 Atuação do Técnico N2 Suporte</w:t>
+        <w:t>Processo 3 - Atuação do Técnico N2 Suporte</w:t>
       </w:r>
     </w:p>
     <w:tbl>
@@ -3343,6 +2858,491 @@
         <w:pStyle w:val="Heading1"/>
       </w:pPr>
       <w:r>
+        <w:t>Definições</w:t>
+      </w:r>
+    </w:p>
+    <w:tbl>
+      <w:tblPr>
+        <w:tblStyle w:val="TableGrid"/>
+        <w:tblW w:type="auto" w:w="0"/>
+        <w:jc w:val="center"/>
+        <w:tblLayout w:type="fixed"/>
+        <w:tblLook w:firstColumn="1" w:firstRow="1" w:lastColumn="0" w:lastRow="0" w:noHBand="0" w:noVBand="1" w:val="04A0"/>
+      </w:tblPr>
+      <w:tblGrid>
+        <w:gridCol w:w="2600"/>
+        <w:gridCol w:w="6760"/>
+      </w:tblGrid>
+      <w:tr>
+        <w:trPr>
+          <w:tblHeader w:val="true"/>
+        </w:trPr>
+        <w:tc>
+          <w:tcPr>
+            <w:tcW w:type="dxa" w:w="2600"/>
+            <w:tcMar>
+              <w:top w:w="90" w:type="dxa"/>
+              <w:start w:w="120" w:type="dxa"/>
+              <w:bottom w:w="90" w:type="dxa"/>
+              <w:end w:w="120" w:type="dxa"/>
+            </w:tcMar>
+            <w:vAlign w:val="center"/>
+            <w:shd w:fill="EAF2F8"/>
+          </w:tcPr>
+          <w:p>
+            <w:pPr>
+              <w:spacing w:after="0"/>
+            </w:pPr>
+            <w:r>
+              <w:rPr>
+                <w:rFonts w:ascii="Arial" w:hAnsi="Arial"/>
+                <w:b/>
+                <w:color w:val="163A63"/>
+                <w:sz w:val="18"/>
+              </w:rPr>
+              <w:t>Termo</w:t>
+            </w:r>
+          </w:p>
+        </w:tc>
+        <w:tc>
+          <w:tcPr>
+            <w:tcW w:type="dxa" w:w="6760"/>
+            <w:tcMar>
+              <w:top w:w="90" w:type="dxa"/>
+              <w:start w:w="120" w:type="dxa"/>
+              <w:bottom w:w="90" w:type="dxa"/>
+              <w:end w:w="120" w:type="dxa"/>
+            </w:tcMar>
+            <w:vAlign w:val="center"/>
+            <w:shd w:fill="EAF2F8"/>
+          </w:tcPr>
+          <w:p>
+            <w:pPr>
+              <w:spacing w:after="0"/>
+            </w:pPr>
+            <w:r>
+              <w:rPr>
+                <w:rFonts w:ascii="Arial" w:hAnsi="Arial"/>
+                <w:b/>
+                <w:color w:val="163A63"/>
+                <w:sz w:val="18"/>
+              </w:rPr>
+              <w:t>Definição</w:t>
+            </w:r>
+          </w:p>
+        </w:tc>
+      </w:tr>
+      <w:tr>
+        <w:tc>
+          <w:tcPr>
+            <w:tcW w:type="dxa" w:w="2600"/>
+            <w:tcMar>
+              <w:top w:w="90" w:type="dxa"/>
+              <w:start w:w="120" w:type="dxa"/>
+              <w:bottom w:w="90" w:type="dxa"/>
+              <w:end w:w="120" w:type="dxa"/>
+            </w:tcMar>
+            <w:vAlign w:val="center"/>
+          </w:tcPr>
+          <w:p>
+            <w:pPr>
+              <w:spacing w:after="0"/>
+            </w:pPr>
+            <w:r>
+              <w:rPr>
+                <w:rFonts w:ascii="Arial" w:hAnsi="Arial"/>
+                <w:sz w:val="18"/>
+              </w:rPr>
+              <w:t>GLPI</w:t>
+            </w:r>
+          </w:p>
+        </w:tc>
+        <w:tc>
+          <w:tcPr>
+            <w:tcW w:type="dxa" w:w="6760"/>
+            <w:tcMar>
+              <w:top w:w="90" w:type="dxa"/>
+              <w:start w:w="120" w:type="dxa"/>
+              <w:bottom w:w="90" w:type="dxa"/>
+              <w:end w:w="120" w:type="dxa"/>
+            </w:tcMar>
+            <w:vAlign w:val="center"/>
+          </w:tcPr>
+          <w:p>
+            <w:pPr>
+              <w:spacing w:after="0"/>
+            </w:pPr>
+            <w:r>
+              <w:rPr>
+                <w:rFonts w:ascii="Arial" w:hAnsi="Arial"/>
+                <w:sz w:val="18"/>
+              </w:rPr>
+              <w:t>Sistema de gestão de chamados e inventário de TI utilizado pela GTIC.</w:t>
+            </w:r>
+          </w:p>
+        </w:tc>
+      </w:tr>
+      <w:tr>
+        <w:tc>
+          <w:tcPr>
+            <w:tcW w:type="dxa" w:w="2600"/>
+            <w:tcMar>
+              <w:top w:w="90" w:type="dxa"/>
+              <w:start w:w="120" w:type="dxa"/>
+              <w:bottom w:w="90" w:type="dxa"/>
+              <w:end w:w="120" w:type="dxa"/>
+            </w:tcMar>
+            <w:vAlign w:val="center"/>
+          </w:tcPr>
+          <w:p>
+            <w:pPr>
+              <w:spacing w:after="0"/>
+            </w:pPr>
+            <w:r>
+              <w:rPr>
+                <w:rFonts w:ascii="Arial" w:hAnsi="Arial"/>
+                <w:sz w:val="18"/>
+              </w:rPr>
+              <w:t>Ativo</w:t>
+            </w:r>
+          </w:p>
+        </w:tc>
+        <w:tc>
+          <w:tcPr>
+            <w:tcW w:type="dxa" w:w="6760"/>
+            <w:tcMar>
+              <w:top w:w="90" w:type="dxa"/>
+              <w:start w:w="120" w:type="dxa"/>
+              <w:bottom w:w="90" w:type="dxa"/>
+              <w:end w:w="120" w:type="dxa"/>
+            </w:tcMar>
+            <w:vAlign w:val="center"/>
+          </w:tcPr>
+          <w:p>
+            <w:pPr>
+              <w:spacing w:after="0"/>
+            </w:pPr>
+            <w:r>
+              <w:rPr>
+                <w:rFonts w:ascii="Arial" w:hAnsi="Arial"/>
+                <w:sz w:val="18"/>
+              </w:rPr>
+              <w:t>Equipamento ou item de TI cadastrado no inventário do GLPI, como computador, monitor, impressora, roteador ou item equivalente.</w:t>
+            </w:r>
+          </w:p>
+        </w:tc>
+      </w:tr>
+      <w:tr>
+        <w:tc>
+          <w:tcPr>
+            <w:tcW w:type="dxa" w:w="2600"/>
+            <w:tcMar>
+              <w:top w:w="90" w:type="dxa"/>
+              <w:start w:w="120" w:type="dxa"/>
+              <w:bottom w:w="90" w:type="dxa"/>
+              <w:end w:w="120" w:type="dxa"/>
+            </w:tcMar>
+            <w:vAlign w:val="center"/>
+          </w:tcPr>
+          <w:p>
+            <w:pPr>
+              <w:spacing w:after="0"/>
+            </w:pPr>
+            <w:r>
+              <w:rPr>
+                <w:rFonts w:ascii="Arial" w:hAnsi="Arial"/>
+                <w:sz w:val="18"/>
+              </w:rPr>
+              <w:t>Chamado principal</w:t>
+            </w:r>
+          </w:p>
+        </w:tc>
+        <w:tc>
+          <w:tcPr>
+            <w:tcW w:type="dxa" w:w="6760"/>
+            <w:tcMar>
+              <w:top w:w="90" w:type="dxa"/>
+              <w:start w:w="120" w:type="dxa"/>
+              <w:bottom w:w="90" w:type="dxa"/>
+              <w:end w:w="120" w:type="dxa"/>
+            </w:tcMar>
+            <w:vAlign w:val="center"/>
+          </w:tcPr>
+          <w:p>
+            <w:pPr>
+              <w:spacing w:after="0"/>
+            </w:pPr>
+            <w:r>
+              <w:rPr>
+                <w:rFonts w:ascii="Arial" w:hAnsi="Arial"/>
+                <w:sz w:val="18"/>
+              </w:rPr>
+              <w:t>Chamado aberto pela Central de Serviços para registrar a solicitação do usuário.</w:t>
+            </w:r>
+          </w:p>
+        </w:tc>
+      </w:tr>
+      <w:tr>
+        <w:tc>
+          <w:tcPr>
+            <w:tcW w:type="dxa" w:w="2600"/>
+            <w:tcMar>
+              <w:top w:w="90" w:type="dxa"/>
+              <w:start w:w="120" w:type="dxa"/>
+              <w:bottom w:w="90" w:type="dxa"/>
+              <w:end w:w="120" w:type="dxa"/>
+            </w:tcMar>
+            <w:vAlign w:val="center"/>
+          </w:tcPr>
+          <w:p>
+            <w:pPr>
+              <w:spacing w:after="0"/>
+            </w:pPr>
+            <w:r>
+              <w:rPr>
+                <w:rFonts w:ascii="Arial" w:hAnsi="Arial"/>
+                <w:sz w:val="18"/>
+              </w:rPr>
+              <w:t>Item associado</w:t>
+            </w:r>
+          </w:p>
+        </w:tc>
+        <w:tc>
+          <w:tcPr>
+            <w:tcW w:type="dxa" w:w="6760"/>
+            <w:tcMar>
+              <w:top w:w="90" w:type="dxa"/>
+              <w:start w:w="120" w:type="dxa"/>
+              <w:bottom w:w="90" w:type="dxa"/>
+              <w:end w:w="120" w:type="dxa"/>
+            </w:tcMar>
+            <w:vAlign w:val="center"/>
+          </w:tcPr>
+          <w:p>
+            <w:pPr>
+              <w:spacing w:after="0"/>
+            </w:pPr>
+            <w:r>
+              <w:rPr>
+                <w:rFonts w:ascii="Arial" w:hAnsi="Arial"/>
+                <w:sz w:val="18"/>
+              </w:rPr>
+              <w:t>Vínculo do ativo ao chamado na aba Itens do GLPI.</w:t>
+            </w:r>
+          </w:p>
+        </w:tc>
+      </w:tr>
+      <w:tr>
+        <w:tc>
+          <w:tcPr>
+            <w:tcW w:type="dxa" w:w="2600"/>
+            <w:tcMar>
+              <w:top w:w="90" w:type="dxa"/>
+              <w:start w:w="120" w:type="dxa"/>
+              <w:bottom w:w="90" w:type="dxa"/>
+              <w:end w:w="120" w:type="dxa"/>
+            </w:tcMar>
+            <w:vAlign w:val="center"/>
+          </w:tcPr>
+          <w:p>
+            <w:pPr>
+              <w:spacing w:after="0"/>
+            </w:pPr>
+            <w:r>
+              <w:rPr>
+                <w:rFonts w:ascii="Arial" w:hAnsi="Arial"/>
+                <w:sz w:val="18"/>
+              </w:rPr>
+              <w:t>Chamado vinculado/associado</w:t>
+            </w:r>
+          </w:p>
+        </w:tc>
+        <w:tc>
+          <w:tcPr>
+            <w:tcW w:type="dxa" w:w="6760"/>
+            <w:tcMar>
+              <w:top w:w="90" w:type="dxa"/>
+              <w:start w:w="120" w:type="dxa"/>
+              <w:bottom w:w="90" w:type="dxa"/>
+              <w:end w:w="120" w:type="dxa"/>
+            </w:tcMar>
+            <w:vAlign w:val="center"/>
+          </w:tcPr>
+          <w:p>
+            <w:pPr>
+              <w:spacing w:after="0"/>
+            </w:pPr>
+            <w:r>
+              <w:rPr>
+                <w:rFonts w:ascii="Arial" w:hAnsi="Arial"/>
+                <w:sz w:val="18"/>
+              </w:rPr>
+              <w:t>Chamado vinculado/associado aberto para regularizar o ativo não localizado e manter relação com o chamado principal.</w:t>
+            </w:r>
+          </w:p>
+        </w:tc>
+      </w:tr>
+      <w:tr>
+        <w:tc>
+          <w:tcPr>
+            <w:tcW w:type="dxa" w:w="2600"/>
+            <w:tcMar>
+              <w:top w:w="90" w:type="dxa"/>
+              <w:start w:w="120" w:type="dxa"/>
+              <w:bottom w:w="90" w:type="dxa"/>
+              <w:end w:w="120" w:type="dxa"/>
+            </w:tcMar>
+            <w:vAlign w:val="center"/>
+          </w:tcPr>
+          <w:p>
+            <w:pPr>
+              <w:spacing w:after="0"/>
+            </w:pPr>
+            <w:r>
+              <w:rPr>
+                <w:rFonts w:ascii="Arial" w:hAnsi="Arial"/>
+                <w:sz w:val="18"/>
+              </w:rPr>
+              <w:t>Central de Serviços</w:t>
+            </w:r>
+          </w:p>
+        </w:tc>
+        <w:tc>
+          <w:tcPr>
+            <w:tcW w:type="dxa" w:w="6760"/>
+            <w:tcMar>
+              <w:top w:w="90" w:type="dxa"/>
+              <w:start w:w="120" w:type="dxa"/>
+              <w:bottom w:w="90" w:type="dxa"/>
+              <w:end w:w="120" w:type="dxa"/>
+            </w:tcMar>
+            <w:vAlign w:val="center"/>
+          </w:tcPr>
+          <w:p>
+            <w:pPr>
+              <w:spacing w:after="0"/>
+            </w:pPr>
+            <w:r>
+              <w:rPr>
+                <w:rFonts w:ascii="Arial" w:hAnsi="Arial"/>
+                <w:sz w:val="18"/>
+              </w:rPr>
+              <w:t>Equipe responsável pela abertura dos chamados no GLPI.</w:t>
+            </w:r>
+          </w:p>
+        </w:tc>
+      </w:tr>
+      <w:tr>
+        <w:tc>
+          <w:tcPr>
+            <w:tcW w:type="dxa" w:w="2600"/>
+            <w:tcMar>
+              <w:top w:w="90" w:type="dxa"/>
+              <w:start w:w="120" w:type="dxa"/>
+              <w:bottom w:w="90" w:type="dxa"/>
+              <w:end w:w="120" w:type="dxa"/>
+            </w:tcMar>
+            <w:vAlign w:val="center"/>
+          </w:tcPr>
+          <w:p>
+            <w:pPr>
+              <w:spacing w:after="0"/>
+            </w:pPr>
+            <w:r>
+              <w:rPr>
+                <w:rFonts w:ascii="Arial" w:hAnsi="Arial"/>
+                <w:sz w:val="18"/>
+              </w:rPr>
+              <w:t>Técnico N2 Suporte</w:t>
+            </w:r>
+          </w:p>
+        </w:tc>
+        <w:tc>
+          <w:tcPr>
+            <w:tcW w:type="dxa" w:w="6760"/>
+            <w:tcMar>
+              <w:top w:w="90" w:type="dxa"/>
+              <w:start w:w="120" w:type="dxa"/>
+              <w:bottom w:w="90" w:type="dxa"/>
+              <w:end w:w="120" w:type="dxa"/>
+            </w:tcMar>
+            <w:vAlign w:val="center"/>
+          </w:tcPr>
+          <w:p>
+            <w:pPr>
+              <w:spacing w:after="0"/>
+            </w:pPr>
+            <w:r>
+              <w:rPr>
+                <w:rFonts w:ascii="Arial" w:hAnsi="Arial"/>
+                <w:sz w:val="18"/>
+              </w:rPr>
+              <w:t>Técnico N2 Suporte responsável por localizar, cadastrar, corrigir ou inventariar ativos físicos no GLPI e associá-los ao chamado principal.</w:t>
+            </w:r>
+          </w:p>
+        </w:tc>
+      </w:tr>
+      <w:tr>
+        <w:tc>
+          <w:tcPr>
+            <w:tcW w:type="dxa" w:w="2600"/>
+            <w:tcMar>
+              <w:top w:w="90" w:type="dxa"/>
+              <w:start w:w="120" w:type="dxa"/>
+              <w:bottom w:w="90" w:type="dxa"/>
+              <w:end w:w="120" w:type="dxa"/>
+            </w:tcMar>
+            <w:vAlign w:val="center"/>
+          </w:tcPr>
+          <w:p>
+            <w:pPr>
+              <w:spacing w:after="0"/>
+            </w:pPr>
+            <w:r>
+              <w:rPr>
+                <w:rFonts w:ascii="Arial" w:hAnsi="Arial"/>
+                <w:sz w:val="18"/>
+              </w:rPr>
+              <w:t>Setor de Sistemas</w:t>
+            </w:r>
+          </w:p>
+        </w:tc>
+        <w:tc>
+          <w:tcPr>
+            <w:tcW w:type="dxa" w:w="6760"/>
+            <w:tcMar>
+              <w:top w:w="90" w:type="dxa"/>
+              <w:start w:w="120" w:type="dxa"/>
+              <w:bottom w:w="90" w:type="dxa"/>
+              <w:end w:w="120" w:type="dxa"/>
+            </w:tcMar>
+            <w:vAlign w:val="center"/>
+          </w:tcPr>
+          <w:p>
+            <w:pPr>
+              <w:spacing w:after="0"/>
+            </w:pPr>
+            <w:r>
+              <w:rPr>
+                <w:rFonts w:ascii="Arial" w:hAnsi="Arial"/>
+                <w:sz w:val="18"/>
+              </w:rPr>
+              <w:t>Equipe responsável por demandas de sistemas. Não realiza inventário e não é responsável por qualquer tipo de ativo físico.</w:t>
+            </w:r>
+          </w:p>
+        </w:tc>
+      </w:tr>
+    </w:tbl>
+    <w:p>
+      <w:pPr>
+        <w:spacing w:after="40"/>
+      </w:pPr>
+    </w:p>
+    <w:p>
+      <w:pPr>
+        <w:pStyle w:val="Heading1"/>
+      </w:pPr>
+      <w:r>
         <w:t>Pontos de Atenção</w:t>
       </w:r>
     </w:p>
@@ -3440,7 +3440,7 @@
         <w:pStyle w:val="Heading1"/>
       </w:pPr>
       <w:r>
-        <w:t>Histórico de Revisões</w:t>
+        <w:t>Histórico de Revisão</w:t>
       </w:r>
     </w:p>
     <w:tbl>

</xml_diff>